<commit_message>
docs(evaluation): complete IT expert evaluation manual with all credentials, URLs, test artifacts, and SQL reference
</commit_message>
<xml_diff>
--- a/docs/AEGIS_IT_Expert_Evaluation_Instructional_Guide.docx
+++ b/docs/AEGIS_IT_Expert_Evaluation_Instructional_Guide.docx
@@ -39,7 +39,7 @@
           <w:color w:val="0F3D23"/>
           <w:sz w:val="26"/>
         </w:rPr>
-        <w:t>A.E.G.I.S. IT EXPERT TECHNICAL EVALUATION GUIDE</w:t>
+        <w:t>A.E.G.I.S. IT EXPERT TECHNICAL EVALUATION &amp; INSTRUCTIONAL MANUAL</w:t>
         <w:br/>
       </w:r>
       <w:r>
@@ -49,9 +49,9 @@
           <w:color w:val="646464"/>
           <w:sz w:val="18"/>
         </w:rPr>
-        <w:t>System Architecture, Security Hardening &amp; ISO/IEC 25010:2023 Assessment Protocol</w:t>
+        <w:t>Comprehensive Technical Reference for Systems Architects, Security Auditors &amp; Faculty Evaluators</w:t>
         <w:br/>
-        <w:t>Document Code: CLSU-CEn-DIT-AEGIS-GUIDE-IT-2026</w:t>
+        <w:t>Document Code: CLSU-CEn-DIT-AEGIS-GUIDE-IT-2026 • ISO/IEC 25010:2023 Standard</w:t>
       </w:r>
     </w:p>
     <w:p>
@@ -69,26 +69,48 @@
     </w:p>
     <w:p>
       <w:r>
-        <w:t>A.E.G.I.S. is an enterprise scholarship governance platform featuring dual-pipeline AI document forensics, automated email notifications, and tamper-evident audit logging for the Central Luzon State University Office of Student Affairs (OSA).</w:t>
-      </w:r>
-    </w:p>
-    <w:p>
-      <w:pPr>
-        <w:pStyle w:val="Heading3"/>
-      </w:pPr>
-      <w:r>
-        <w:t>Technical Architecture &amp; Specifications:</w:t>
+        <w:t>A.E.G.I.S. (AI-Enhanced Grant Information System) is an enterprise scholarship governance platform engineered for the Central Luzon State University (CLSU) Office of Student Affairs (OSA). It transitions traditional, manual paper scholarship intake into an automated, tamper-evident digital ecosystem.</w:t>
       </w:r>
     </w:p>
     <w:p>
       <w:r>
-        <w:t>• Web Tier: Laravel 12 (PHP 8.2), Blade Engine, Vanilla CSS &amp; Tailwind CSS, Bootstrap 5.</w:t>
+        <w:rPr>
+          <w:b/>
+        </w:rPr>
+        <w:t xml:space="preserve">• Web &amp; Backend Tier: </w:t>
+      </w:r>
+      <w:r>
+        <w:t>Laravel 12.x running on PHP 8.2+ with Blade templating, Vanilla CSS, Tailwind CSS, and Bootstrap 5.</w:t>
         <w:br/>
-        <w:t>• Forensic AI Tier: Python Flask microservice integrating Error Level Analysis (ELA 95%), ResNet-50 CNN, SIFT clone detection, and Grad-CAM localized heatmaps.</w:t>
+      </w:r>
+      <w:r>
+        <w:rPr>
+          <w:b/>
+        </w:rPr>
+        <w:t xml:space="preserve">• Forensic AI Microservice: </w:t>
+      </w:r>
+      <w:r>
+        <w:t>Python 3.11 Flask API running dual-pipeline analysis: Error Level Analysis (ELA 95%), ResNet-50 CNN classification, SIFT keypoint clone-stamp matching, and Grad-CAM localized heatmaps.</w:t>
         <w:br/>
-        <w:t>• Data &amp; Storage Tier: SQLite (Dev) / PostgreSQL &amp; MySQL 8.0 (Prod), Cloudflare R2 / S3 object storage, AES-256 database column encryption.</w:t>
+      </w:r>
+      <w:r>
+        <w:rPr>
+          <w:b/>
+        </w:rPr>
+        <w:t xml:space="preserve">• Database &amp; Storage Tier: </w:t>
+      </w:r>
+      <w:r>
+        <w:t>SQLite (Dev/Staging) / PostgreSQL &amp; MySQL 8.0 (Prod) with AES-256-CBC column-level encryption and Cloudflare R2 / S3 persistent storage with Base64 DB backup.</w:t>
         <w:br/>
-        <w:t>• Statutory Controls: R.A. 10173 (Data Privacy Act of 2012) compliant, SHA-256 zero-knowledge OTP hashing at rest, immutable action logging.</w:t>
+      </w:r>
+      <w:r>
+        <w:rPr>
+          <w:b/>
+        </w:rPr>
+        <w:t xml:space="preserve">• Statutory Controls: </w:t>
+      </w:r>
+      <w:r>
+        <w:t>R.A. 10173 (Data Privacy Act of 2012) compliant, SHA-256 zero-knowledge OTP hashing at rest, immutable action logging, role-based authorization gates.</w:t>
       </w:r>
     </w:p>
     <w:p>
@@ -96,7 +118,234 @@
         <w:pStyle w:val="Heading2"/>
       </w:pPr>
       <w:r>
-        <w:t>2. Evaluation Accounts Cheat Sheet</w:t>
+        <w:t>2. System Access &amp; Endpoints Directory</w:t>
+      </w:r>
+    </w:p>
+    <w:tbl>
+      <w:tblPr>
+        <w:tblW w:type="auto" w:w="0"/>
+        <w:jc w:val="center"/>
+        <w:tblLook w:firstColumn="1" w:firstRow="1" w:lastColumn="0" w:lastRow="0" w:noHBand="0" w:noVBand="1" w:val="04A0"/>
+      </w:tblPr>
+      <w:tblGrid>
+        <w:gridCol w:w="3312"/>
+        <w:gridCol w:w="3312"/>
+        <w:gridCol w:w="3312"/>
+      </w:tblGrid>
+      <w:tr>
+        <w:tc>
+          <w:tcPr>
+            <w:tcW w:type="dxa" w:w="3312"/>
+            <w:shd w:fill="0F3D23"/>
+          </w:tcPr>
+          <w:p>
+            <w:r>
+              <w:rPr>
+                <w:b/>
+                <w:color w:val="FFFFFF"/>
+              </w:rPr>
+              <w:t>Environment / Route</w:t>
+            </w:r>
+          </w:p>
+        </w:tc>
+        <w:tc>
+          <w:tcPr>
+            <w:tcW w:type="dxa" w:w="3312"/>
+            <w:shd w:fill="0F3D23"/>
+          </w:tcPr>
+          <w:p>
+            <w:r>
+              <w:rPr>
+                <w:b/>
+                <w:color w:val="FFFFFF"/>
+              </w:rPr>
+              <w:t>Access URL / Endpoint</w:t>
+            </w:r>
+          </w:p>
+        </w:tc>
+        <w:tc>
+          <w:tcPr>
+            <w:tcW w:type="dxa" w:w="3312"/>
+            <w:shd w:fill="0F3D23"/>
+          </w:tcPr>
+          <w:p>
+            <w:r>
+              <w:rPr>
+                <w:b/>
+                <w:color w:val="FFFFFF"/>
+              </w:rPr>
+              <w:t>Technical Purpose</w:t>
+            </w:r>
+          </w:p>
+        </w:tc>
+      </w:tr>
+      <w:tr>
+        <w:tc>
+          <w:tcPr>
+            <w:tcW w:type="dxa" w:w="3312"/>
+          </w:tcPr>
+          <w:p>
+            <w:r>
+              <w:t>Live Cloud Staging (Render)</w:t>
+            </w:r>
+          </w:p>
+        </w:tc>
+        <w:tc>
+          <w:tcPr>
+            <w:tcW w:type="dxa" w:w="3312"/>
+          </w:tcPr>
+          <w:p>
+            <w:r>
+              <w:t>https://aegis-capstone.onrender.com</w:t>
+            </w:r>
+          </w:p>
+        </w:tc>
+        <w:tc>
+          <w:tcPr>
+            <w:tcW w:type="dxa" w:w="3312"/>
+          </w:tcPr>
+          <w:p>
+            <w:r>
+              <w:t>Primary live evaluation instance with full features active.</w:t>
+            </w:r>
+          </w:p>
+        </w:tc>
+      </w:tr>
+      <w:tr>
+        <w:tc>
+          <w:tcPr>
+            <w:tcW w:type="dxa" w:w="3312"/>
+          </w:tcPr>
+          <w:p>
+            <w:r>
+              <w:t>Local Development Instance</w:t>
+            </w:r>
+          </w:p>
+        </w:tc>
+        <w:tc>
+          <w:tcPr>
+            <w:tcW w:type="dxa" w:w="3312"/>
+          </w:tcPr>
+          <w:p>
+            <w:r>
+              <w:t>http://localhost:8000</w:t>
+            </w:r>
+          </w:p>
+        </w:tc>
+        <w:tc>
+          <w:tcPr>
+            <w:tcW w:type="dxa" w:w="3312"/>
+          </w:tcPr>
+          <w:p>
+            <w:r>
+              <w:t>Local fallback environment for offline/LAN evaluation.</w:t>
+            </w:r>
+          </w:p>
+        </w:tc>
+      </w:tr>
+      <w:tr>
+        <w:tc>
+          <w:tcPr>
+            <w:tcW w:type="dxa" w:w="3312"/>
+          </w:tcPr>
+          <w:p>
+            <w:r>
+              <w:t>System Health Check API</w:t>
+            </w:r>
+          </w:p>
+        </w:tc>
+        <w:tc>
+          <w:tcPr>
+            <w:tcW w:type="dxa" w:w="3312"/>
+          </w:tcPr>
+          <w:p>
+            <w:r>
+              <w:t>https://aegis-capstone.onrender.com/api/health-check</w:t>
+            </w:r>
+          </w:p>
+        </w:tc>
+        <w:tc>
+          <w:tcPr>
+            <w:tcW w:type="dxa" w:w="3312"/>
+          </w:tcPr>
+          <w:p>
+            <w:r>
+              <w:t>JSON endpoint reporting DB latency, queue state, and memory.</w:t>
+            </w:r>
+          </w:p>
+        </w:tc>
+      </w:tr>
+      <w:tr>
+        <w:tc>
+          <w:tcPr>
+            <w:tcW w:type="dxa" w:w="3312"/>
+          </w:tcPr>
+          <w:p>
+            <w:r>
+              <w:t>Public Scholarship Catalog</w:t>
+            </w:r>
+          </w:p>
+        </w:tc>
+        <w:tc>
+          <w:tcPr>
+            <w:tcW w:type="dxa" w:w="3312"/>
+          </w:tcPr>
+          <w:p>
+            <w:r>
+              <w:t>https://aegis-capstone.onrender.com/scholarships</w:t>
+            </w:r>
+          </w:p>
+        </w:tc>
+        <w:tc>
+          <w:tcPr>
+            <w:tcW w:type="dxa" w:w="3312"/>
+          </w:tcPr>
+          <w:p>
+            <w:r>
+              <w:t>Public scholarship discovery without authentication requirement.</w:t>
+            </w:r>
+          </w:p>
+        </w:tc>
+      </w:tr>
+      <w:tr>
+        <w:tc>
+          <w:tcPr>
+            <w:tcW w:type="dxa" w:w="3312"/>
+          </w:tcPr>
+          <w:p>
+            <w:r>
+              <w:t>Application QR Verification</w:t>
+            </w:r>
+          </w:p>
+        </w:tc>
+        <w:tc>
+          <w:tcPr>
+            <w:tcW w:type="dxa" w:w="3312"/>
+          </w:tcPr>
+          <w:p>
+            <w:r>
+              <w:t>https://aegis-capstone.onrender.com/verify/application/{code}</w:t>
+            </w:r>
+          </w:p>
+        </w:tc>
+        <w:tc>
+          <w:tcPr>
+            <w:tcW w:type="dxa" w:w="3312"/>
+          </w:tcPr>
+          <w:p>
+            <w:r>
+              <w:t>Validates tamper-evident cryptographic QR clearance codes.</w:t>
+            </w:r>
+          </w:p>
+        </w:tc>
+      </w:tr>
+    </w:tbl>
+    <w:p>
+      <w:pPr>
+        <w:pStyle w:val="Heading2"/>
+      </w:pPr>
+      <w:r>
+        <w:t>3. Complete Test Accounts &amp; Credentials Directory</w:t>
       </w:r>
     </w:p>
     <w:tbl>
@@ -123,7 +372,7 @@
                 <w:b/>
                 <w:color w:val="FFFFFF"/>
               </w:rPr>
-              <w:t>Role</w:t>
+              <w:t>Role / Identity</w:t>
             </w:r>
           </w:p>
         </w:tc>
@@ -138,7 +387,7 @@
                 <w:b/>
                 <w:color w:val="FFFFFF"/>
               </w:rPr>
-              <w:t>Email</w:t>
+              <w:t>Email Address</w:t>
             </w:r>
           </w:p>
         </w:tc>
@@ -168,7 +417,7 @@
                 <w:b/>
                 <w:color w:val="FFFFFF"/>
               </w:rPr>
-              <w:t>Security &amp; MFA Behavior</w:t>
+              <w:t>MFA Security &amp; Evaluation Behavior</w:t>
             </w:r>
           </w:p>
         </w:tc>
@@ -180,7 +429,7 @@
           </w:tcPr>
           <w:p>
             <w:r>
-              <w:t>SuperAdmin / Director</w:t>
+              <w:t>SuperAdmin / OSA Director</w:t>
             </w:r>
           </w:p>
         </w:tc>
@@ -210,7 +459,7 @@
           </w:tcPr>
           <w:p>
             <w:r>
-              <w:t>Auto-Bypassed (Demo Mode)</w:t>
+              <w:t>Auto-Bypassed (Instant login). Full governance, term switch, audit logs.</w:t>
             </w:r>
           </w:p>
         </w:tc>
@@ -222,7 +471,49 @@
           </w:tcPr>
           <w:p>
             <w:r>
-              <w:t>Admin / Staff Evaluator</w:t>
+              <w:t>Master Administrator</w:t>
+            </w:r>
+          </w:p>
+        </w:tc>
+        <w:tc>
+          <w:tcPr>
+            <w:tcW w:type="dxa" w:w="2484"/>
+          </w:tcPr>
+          <w:p>
+            <w:r>
+              <w:t>gadianoriel07@gmail.com</w:t>
+            </w:r>
+          </w:p>
+        </w:tc>
+        <w:tc>
+          <w:tcPr>
+            <w:tcW w:type="dxa" w:w="2484"/>
+          </w:tcPr>
+          <w:p>
+            <w:r>
+              <w:t>password</w:t>
+            </w:r>
+          </w:p>
+        </w:tc>
+        <w:tc>
+          <w:tcPr>
+            <w:tcW w:type="dxa" w:w="2484"/>
+          </w:tcPr>
+          <w:p>
+            <w:r>
+              <w:t>Auto-Bypassed. Master gateway, system maintenance, security controls.</w:t>
+            </w:r>
+          </w:p>
+        </w:tc>
+      </w:tr>
+      <w:tr>
+        <w:tc>
+          <w:tcPr>
+            <w:tcW w:type="dxa" w:w="2484"/>
+          </w:tcPr>
+          <w:p>
+            <w:r>
+              <w:t>OSA Staff / Administrator</w:t>
             </w:r>
           </w:p>
         </w:tc>
@@ -252,7 +543,7 @@
           </w:tcPr>
           <w:p>
             <w:r>
-              <w:t>Auto-Bypassed (Demo Mode)</w:t>
+              <w:t>Auto-Bypassed. Intake review queue, AI inspection, decision overrides.</w:t>
             </w:r>
           </w:p>
         </w:tc>
@@ -264,7 +555,7 @@
           </w:tcPr>
           <w:p>
             <w:r>
-              <w:t>Student (Active History)</w:t>
+              <w:t>Student 1 (Active History)</w:t>
             </w:r>
           </w:p>
         </w:tc>
@@ -294,7 +585,7 @@
           </w:tcPr>
           <w:p>
             <w:r>
-              <w:t>Demo OTP: 123456 or 000000</w:t>
+              <w:t>Demo OTP: 123456 or 000000. Juan Dela Cruz (ID: 22-1234). Status tracker.</w:t>
             </w:r>
           </w:p>
         </w:tc>
@@ -306,7 +597,7 @@
           </w:tcPr>
           <w:p>
             <w:r>
-              <w:t>Student (Clean /apply)</w:t>
+              <w:t>Student 2 (Fresh /apply)</w:t>
             </w:r>
           </w:p>
         </w:tc>
@@ -336,7 +627,7 @@
           </w:tcPr>
           <w:p>
             <w:r>
-              <w:t>Demo OTP: 123456 or 000000</w:t>
+              <w:t>Demo OTP: 123456 or 000000. Maria Clara Santos (ID: 23-5678). Live submission.</w:t>
             </w:r>
           </w:p>
         </w:tc>
@@ -347,117 +638,323 @@
         <w:pStyle w:val="Heading2"/>
       </w:pPr>
       <w:r>
-        <w:t>3. Technical Verification Procedures (TC-IT-01 to TC-IT-10)</w:t>
+        <w:t>4. Test Artifacts &amp; Forensic Documents Repository</w:t>
+      </w:r>
+    </w:p>
+    <w:p>
+      <w:r>
+        <w:t>For evaluating the AI Document Forensics module (TC-IT-05) and testing live student submission (TC-STU-02), the following sample Certificate of Grades (COG) documents are prepared and directly downloadable:</w:t>
+      </w:r>
+    </w:p>
+    <w:tbl>
+      <w:tblPr>
+        <w:tblW w:type="auto" w:w="0"/>
+        <w:jc w:val="center"/>
+        <w:tblLook w:firstColumn="1" w:firstRow="1" w:lastColumn="0" w:lastRow="0" w:noHBand="0" w:noVBand="1" w:val="04A0"/>
+      </w:tblPr>
+      <w:tblGrid>
+        <w:gridCol w:w="3312"/>
+        <w:gridCol w:w="3312"/>
+        <w:gridCol w:w="3312"/>
+      </w:tblGrid>
+      <w:tr>
+        <w:tc>
+          <w:tcPr>
+            <w:tcW w:type="dxa" w:w="3312"/>
+            <w:shd w:fill="0F3D23"/>
+          </w:tcPr>
+          <w:p>
+            <w:r>
+              <w:rPr>
+                <w:b/>
+                <w:color w:val="FFFFFF"/>
+              </w:rPr>
+              <w:t>Document Fixture</w:t>
+            </w:r>
+          </w:p>
+        </w:tc>
+        <w:tc>
+          <w:tcPr>
+            <w:tcW w:type="dxa" w:w="3312"/>
+            <w:shd w:fill="0F3D23"/>
+          </w:tcPr>
+          <w:p>
+            <w:r>
+              <w:rPr>
+                <w:b/>
+                <w:color w:val="FFFFFF"/>
+              </w:rPr>
+              <w:t>Download URL / Repository Path</w:t>
+            </w:r>
+          </w:p>
+        </w:tc>
+        <w:tc>
+          <w:tcPr>
+            <w:tcW w:type="dxa" w:w="3312"/>
+            <w:shd w:fill="0F3D23"/>
+          </w:tcPr>
+          <w:p>
+            <w:r>
+              <w:rPr>
+                <w:b/>
+                <w:color w:val="FFFFFF"/>
+              </w:rPr>
+              <w:t>Forensic Characteristics</w:t>
+            </w:r>
+          </w:p>
+        </w:tc>
+      </w:tr>
+      <w:tr>
+        <w:tc>
+          <w:tcPr>
+            <w:tcW w:type="dxa" w:w="3312"/>
+          </w:tcPr>
+          <w:p>
+            <w:r>
+              <w:t>Authentic CLSU COG</w:t>
+            </w:r>
+          </w:p>
+        </w:tc>
+        <w:tc>
+          <w:tcPr>
+            <w:tcW w:type="dxa" w:w="3312"/>
+          </w:tcPr>
+          <w:p>
+            <w:r>
+              <w:t>https://aegis-capstone.onrender.com/documents/sample_cog_authentic.jpg</w:t>
+              <w:br/>
+              <w:t>(Local: public/documents/sample_cog_authentic.jpg)</w:t>
+            </w:r>
+          </w:p>
+        </w:tc>
+        <w:tc>
+          <w:tcPr>
+            <w:tcW w:type="dxa" w:w="3312"/>
+          </w:tcPr>
+          <w:p>
+            <w:r>
+              <w:t>Authentic academic document. Consistent JPEG compression and authentic registrar seal.</w:t>
+            </w:r>
+          </w:p>
+        </w:tc>
+      </w:tr>
+      <w:tr>
+        <w:tc>
+          <w:tcPr>
+            <w:tcW w:type="dxa" w:w="3312"/>
+          </w:tcPr>
+          <w:p>
+            <w:r>
+              <w:t>Tampered CLSU COG</w:t>
+            </w:r>
+          </w:p>
+        </w:tc>
+        <w:tc>
+          <w:tcPr>
+            <w:tcW w:type="dxa" w:w="3312"/>
+          </w:tcPr>
+          <w:p>
+            <w:r>
+              <w:t>https://aegis-capstone.onrender.com/documents/sample_cog_tampered.jpg</w:t>
+              <w:br/>
+              <w:t>(Local: public/documents/sample_cog_tampered.jpg)</w:t>
+            </w:r>
+          </w:p>
+        </w:tc>
+        <w:tc>
+          <w:tcPr>
+            <w:tcW w:type="dxa" w:w="3312"/>
+          </w:tcPr>
+          <w:p>
+            <w:r>
+              <w:t>Digitally spliced grade modification (1.00) creating distinct ELA error levels and anomalous Grad-CAM heatmap.</w:t>
+            </w:r>
+          </w:p>
+        </w:tc>
+      </w:tr>
+    </w:tbl>
+    <w:p>
+      <w:pPr>
+        <w:pStyle w:val="Heading2"/>
+      </w:pPr>
+      <w:r>
+        <w:t>5. Step-by-Step Technical Verification Procedures (TC-IT-01 to TC-IT-10)</w:t>
       </w:r>
     </w:p>
     <w:p>
       <w:r>
         <w:rPr>
           <w:b/>
+          <w:sz w:val="21"/>
         </w:rPr>
-        <w:t xml:space="preserve">• TC-IT-01: Authentication Hardening &amp; SQLi Protection: </w:t>
+        <w:t>TC-IT-01: Authentication Hardening, SQL Injection &amp; Brute Force Throttling</w:t>
+        <w:br/>
       </w:r>
       <w:r>
-        <w:t>Inject SQL syntax on /login (e.g. ' OR 1=1--). Verify Eloquent PDO parameter binding, bcrypt cost=12 hashing, and 5 attempts/min rate limiting returning HTTP 429.</w:t>
+        <w:t>• Route: POST /login</w:t>
+        <w:br/>
+        <w:t>• Injection Test: Submit email "' OR 1=1--" with any password. Verify Eloquent PDO binding neutralizes injection without leaking database errors.</w:t>
+        <w:br/>
+        <w:t>• Throttling Test: Submit 6 consecutive wrong passwords within 60 seconds. Verify rate-limiter returns HTTP 429 Too Many Requests.</w:t>
+        <w:br/>
+        <w:t>• Password Hashing: Inspect users table in database; verify Bcrypt cost=12 hashing.</w:t>
       </w:r>
     </w:p>
     <w:p>
       <w:r>
         <w:rPr>
           <w:b/>
+          <w:sz w:val="21"/>
         </w:rPr>
-        <w:t xml:space="preserve">• TC-IT-02: MFA &amp; Zero-Knowledge Hashing: </w:t>
+        <w:t>TC-IT-02: Multi-Factor Authentication &amp; Zero-Knowledge OTP Storage</w:t>
+        <w:br/>
       </w:r>
       <w:r>
-        <w:t>Trigger 6-digit OTP delivery. Verify database storage as 64-character SHA-256 hash at rest, 10-minute dynamic TTL, and test code 123456 acceptance.</w:t>
+        <w:t>• Route: POST /login -&gt; POST /mfa/verify</w:t>
+        <w:br/>
+        <w:t>• Test: Sign in as student@clsu.edu.ph / password. Observe redirection to /login/mfa.</w:t>
+        <w:br/>
+        <w:t>• Database Inspection: Inspect otp_code column in users table. Verify it is stored strictly as a 64-char SHA-256 hash. Plaintext OTP is NEVER stored at rest.</w:t>
+        <w:br/>
+        <w:t>• Dynamic TTL: Verify 10-minute dynamic countdown (10:00). Input demo code 123456 or 000000 to authenticate.</w:t>
       </w:r>
     </w:p>
     <w:p>
       <w:r>
         <w:rPr>
           <w:b/>
+          <w:sz w:val="21"/>
         </w:rPr>
-        <w:t xml:space="preserve">• TC-IT-03: AES-256 Column Encryption at Rest: </w:t>
+        <w:t>TC-IT-03: AES-256 Column Encryption at Rest</w:t>
+        <w:br/>
       </w:r>
       <w:r>
-        <w:t>Inspect student_profiles table in DB. Confirm clsu_id_number, contact_number, and guardian info are encrypted with AES-256-CBC and decrypted in-memory only.</w:t>
+        <w:t>• Model: App\Models\StudentProfile</w:t>
+        <w:br/>
+        <w:t>• Inspection: Query raw database records: SELECT clsu_id_number, contact_number FROM student_profiles.</w:t>
+        <w:br/>
+        <w:t>• Verification: Values are stored as AES-256-CBC ciphertexts starting with base64 JSON payload (eyJpdiI6...). Values are decrypted in-memory only during authenticated sessions.</w:t>
       </w:r>
     </w:p>
     <w:p>
       <w:r>
         <w:rPr>
           <w:b/>
+          <w:sz w:val="21"/>
         </w:rPr>
-        <w:t xml:space="preserve">• TC-IT-04: RBAC &amp; Authorization Gates: </w:t>
+        <w:t>TC-IT-04: Role-Based Access Control (RBAC) &amp; Boundary Isolation</w:t>
+        <w:br/>
       </w:r>
       <w:r>
-        <w:t>Authenticate as Student and attempt direct URL navigation to /admin/dashboard, /superadmin/scholarships, and /superadmin/settings. Verify HTTP 403 / unauthorized block.</w:t>
+        <w:t>• Account: student@clsu.edu.ph / password</w:t>
+        <w:br/>
+        <w:t>• Test: As Student, manually navigate to /admin/dashboard, /superadmin/scholarships, /superadmin/users, /superadmin/audit-logs, /superadmin/settings.</w:t>
+        <w:br/>
+        <w:t>• Expected: CheckRole middleware strictly intercepts every request; returns HTTP 403 Forbidden or safe redirection without DOM state leakage.</w:t>
       </w:r>
     </w:p>
     <w:p>
       <w:r>
         <w:rPr>
           <w:b/>
+          <w:sz w:val="21"/>
         </w:rPr>
-        <w:t xml:space="preserve">• TC-IT-05: AI Forensic ELA-CNN Pipeline: </w:t>
+        <w:t>TC-IT-05: AI Forensic ELA-CNN Pipeline &amp; Grad-CAM Explainability</w:t>
+        <w:br/>
       </w:r>
       <w:r>
-        <w:t>Submit or inspect tampered Certificate of Grades. Verify Fraud Probability Score (0-100%), risk badge, ELA difference map, and Grad-CAM explainability heatmap overlay.</w:t>
+        <w:t>• Route: GET /admin/review/{id}</w:t>
+        <w:br/>
+        <w:t>• Account: admin@clsu.edu.ph / password</w:t>
+        <w:br/>
+        <w:t>• Inspection: Open application review screen. Verify Fraud Probability Score (0-100%), risk tier badge (Low, Moderate, High), ELA difference map, and Grad-CAM localized heatmap overlay.</w:t>
+        <w:br/>
+        <w:t>• Autonomy: Verify human decision override: Admin can approve or reject with mandatory justification logging.</w:t>
       </w:r>
     </w:p>
     <w:p>
       <w:r>
         <w:rPr>
           <w:b/>
+          <w:sz w:val="21"/>
         </w:rPr>
-        <w:t xml:space="preserve">• TC-IT-06: Tamper-Evident Audit Logging: </w:t>
+        <w:t>TC-IT-06: Tamper-Evident Audit Logging &amp; Statutory Non-Repudiation</w:t>
+        <w:br/>
       </w:r>
       <w:r>
-        <w:t>Perform status update or export. Navigate to /superadmin/audit-logs. Verify immutable structured capture of actor identity, IP, user-agent hash, timestamp, and JSON diffs.</w:t>
+        <w:t>• Route: GET /superadmin/audit-logs</w:t>
+        <w:br/>
+        <w:t>• Account: director@clsu.edu.ph / password</w:t>
+        <w:br/>
+        <w:t>• Inspection: Trigger an administrative action (e.g. approve an application, modify active semester). Navigate to audit logs.</w:t>
+        <w:br/>
+        <w:t>• Verification: Verify structured log entries containing Actor ID, Email, IP address, User-Agent hash, timestamp, and JSON before/after state diffs.</w:t>
       </w:r>
     </w:p>
     <w:p>
       <w:r>
         <w:rPr>
           <w:b/>
+          <w:sz w:val="21"/>
         </w:rPr>
-        <w:t xml:space="preserve">• TC-IT-07: Transport &amp; Session Security Headers: </w:t>
+        <w:t>TC-IT-07: Transport Security &amp; Session Hardening</w:t>
+        <w:br/>
       </w:r>
       <w:r>
-        <w:t>Inspect network headers in DevTools. Confirm HSTS, X-Frame-Options, X-Content-Type-Options, CSP, and cookies marked HttpOnly, Secure, SameSite=Lax.</w:t>
+        <w:t>• Inspection: Open Browser DevTools (F12) &gt; Network tab on any authenticated page.</w:t>
+        <w:br/>
+        <w:t>• Headers: Verify Strict-Transport-Security, X-Frame-Options: SAMEORIGIN, X-Content-Type-Options: nosniff, and CSP directives.</w:t>
+        <w:br/>
+        <w:t>• Cookies: Verify session cookies are flagged HttpOnly, Secure, and SameSite=Lax.</w:t>
       </w:r>
     </w:p>
     <w:p>
       <w:r>
         <w:rPr>
           <w:b/>
+          <w:sz w:val="21"/>
         </w:rPr>
-        <w:t xml:space="preserve">• TC-IT-08: Isolated PDF &amp; Print Engine: </w:t>
+        <w:t>TC-IT-08: High-Fidelity 1-Page PDF &amp; Isolated Iframe Print Engine</w:t>
+        <w:br/>
       </w:r>
       <w:r>
-        <w:t>Trigger evaluation sheet print. Verify exact 1-page letter layout without blank pages, high-res seal, and cryptographic validation QR code leading to verification endpoint.</w:t>
+        <w:t>• Route: In /admin/review/{id}, click "Generate Evaluation Sheet" or "Print Preview".</w:t>
+        <w:br/>
+        <w:t>• Verification: Verify 1-page letter layout without clipping; includes CLSU seal, verification checklist, and cryptographic QR code.</w:t>
+        <w:br/>
+        <w:t>• QR Verification: Scan or open /verify/application/{code}; verify official verification clearance page.</w:t>
       </w:r>
     </w:p>
     <w:p>
       <w:r>
         <w:rPr>
           <w:b/>
+          <w:sz w:val="21"/>
         </w:rPr>
-        <w:t xml:space="preserve">• TC-IT-09: Asynchronous Queuing &amp; Fault Recovery: </w:t>
+        <w:t>TC-IT-09: Asynchronous Queuing &amp; Fault Recovery</w:t>
+        <w:br/>
       </w:r>
       <w:r>
-        <w:t>Dispatch batch AI analysis. Verify background queue execution, zero UI freeze, and exponential retry schedules ([15s, 45s, 90s, 180s, 360s]) for container cold starts.</w:t>
+        <w:t>• Verification: Document uploads and heavy forensic inference are dispatched to database queue workers (php artisan queue:work).</w:t>
+        <w:br/>
+        <w:t>• Fault Tolerance: Exponential retry backoffs ([15s, 45s, 90s, 180s, 360s]) absorb AI microservice cold-start connection timeouts.</w:t>
       </w:r>
     </w:p>
     <w:p>
       <w:r>
         <w:rPr>
           <w:b/>
+          <w:sz w:val="21"/>
         </w:rPr>
-        <w:t xml:space="preserve">• TC-IT-10: Database Portability &amp; Asset Optimization: </w:t>
+        <w:t>TC-IT-10: Database Portability &amp; Asset Optimization</w:t>
+        <w:br/>
       </w:r>
       <w:r>
-        <w:t>Verify cross-DB migration integrity (SQLite/MySQL/PostgreSQL), eager loading query efficiency (zero N+1 queries), and production Vite Gzip asset compression (&gt;75%).</w:t>
+        <w:t>• Verification: Database migrations execute identically on SQLite and PostgreSQL.</w:t>
+        <w:br/>
+        <w:t>• Eager Loading: Zero N+1 query overhead via Eloquent with(...) eager loading.</w:t>
+        <w:br/>
+        <w:t>• Bundling: Production Vite compiled bundles in /public/build/assets/ achieve &gt;75% size reduction under Gzip compression.</w:t>
       </w:r>
     </w:p>
     <w:p>
@@ -465,27 +962,89 @@
         <w:pStyle w:val="Heading2"/>
       </w:pPr>
       <w:r>
-        <w:t>4. ISO/IEC 25010:2023 Product Quality Rating</w:t>
+        <w:t>6. Database Inspection SQL Reference</w:t>
       </w:r>
     </w:p>
     <w:p>
       <w:r>
-        <w:t>Please rate each of the 24 technical statements in Part 2 of the evaluation form using the 5-point Likert scale:</w:t>
-        <w:br/>
-        <w:t>5 - Strongly Agree (Exceeds expectations)</w:t>
-        <w:br/>
-        <w:t>4 - Agree (Meets all technical standards)</w:t>
-        <w:br/>
-        <w:t>3 - Neither Agree nor Disagree (Acceptable)</w:t>
-        <w:br/>
-        <w:t>2 - Disagree (Technical revision needed)</w:t>
-        <w:br/>
-        <w:t>1 - Strongly Disagree (Critical flaw detected)</w:t>
-        <w:br/>
-        <w:t>N/A - Not Applicable</w:t>
+        <w:t>Evaluators inspecting the backend database directly may use the following SQL queries:</w:t>
         <w:br/>
         <w:br/>
-        <w:t>Complete Part 3 by indicating your overall acceptance recommendation and affixing your signature.</w:t>
+      </w:r>
+      <w:r>
+        <w:rPr>
+          <w:rFonts w:ascii="Consolas" w:hAnsi="Consolas"/>
+          <w:sz w:val="17"/>
+        </w:rPr>
+        <w:t>-- 1. Inspect AES-256 Column Encryption (Raw Ciphertext)</w:t>
+        <w:br/>
+        <w:t>SELECT id, user_id, clsu_id_number, contact_number, emergency_contact_number FROM student_profiles LIMIT 2;</w:t>
+        <w:br/>
+        <w:br/>
+        <w:t>-- 2. Inspect SHA-256 Zero-Knowledge OTP Storage (64-char Hash)</w:t>
+        <w:br/>
+        <w:t>SELECT id, name, email, otp_code, otp_expires_at FROM users WHERE role = 'student';</w:t>
+        <w:br/>
+        <w:br/>
+        <w:t>-- 3. Inspect Audit Logs (Actor, IP, User-Agent, JSON Diff)</w:t>
+        <w:br/>
+        <w:t>SELECT id, user_id, action, ip_address, user_agent, created_at FROM admin_action_logs ORDER BY id DESC LIMIT 5;</w:t>
+        <w:br/>
+        <w:br/>
+        <w:t>-- 4. Inspect Academic Term State (Active Term Governance)</w:t>
+        <w:br/>
+        <w:t>SELECT id, semester, academic_year, is_active FROM academic_terms ORDER BY is_active DESC;</w:t>
+      </w:r>
+    </w:p>
+    <w:p>
+      <w:pPr>
+        <w:pStyle w:val="Heading2"/>
+      </w:pPr>
+      <w:r>
+        <w:t>7. ISO/IEC 25010:2023 Product Quality Rating Guide</w:t>
+      </w:r>
+    </w:p>
+    <w:p>
+      <w:r>
+        <w:t>Please score the 24 technical statements in Part 2 of the evaluation form across all eight (8) standard ISO/IEC 25010 quality characteristics:</w:t>
+        <w:br/>
+        <w:t>• 1. Functional Suitability (Completeness, Calculation Correctness, Technical Appropriateness)</w:t>
+        <w:br/>
+        <w:t>• 2. Performance Efficiency (Time Behavior &lt;1.5s, Resource Utilization, Concurrent Queue Capacity)</w:t>
+        <w:br/>
+        <w:t>• 3. Compatibility (Multi-Container Co-existence, Brevo SMTP API, Cloudflare R2 Interoperability)</w:t>
+        <w:br/>
+        <w:t>• 4. Usability (Interface Consistency, Input Validation, Accessibility, Guided Tour)</w:t>
+        <w:br/>
+        <w:t>• 5. Reliability (Fault Tolerance, Recoverability, Regression Stability)</w:t>
+        <w:br/>
+        <w:t>• 6. Security (AES-256 Encryption at Rest, SHA-256 OTP Hashing, RBAC Isolation, Non-Repudiation)</w:t>
+        <w:br/>
+        <w:t>• 7. Maintainability (Modularity, Service Layer Abstraction, Automated Test Coverage with 36 Assertions)</w:t>
+        <w:br/>
+        <w:t>• 8. Portability (Cross-Browser Adaptability across Chrome, Edge, Safari, Firefox, and Cloud Containerization)</w:t>
+        <w:br/>
+        <w:br/>
+        <w:t>Rating Scale: 5 = Strongly Agree, 4 = Agree, 3 = Neither Agree nor Disagree, 2 = Disagree, 1 = Strongly Disagree, N/A = Not Applicable.</w:t>
+      </w:r>
+    </w:p>
+    <w:p>
+      <w:pPr>
+        <w:pStyle w:val="Heading2"/>
+      </w:pPr>
+      <w:r>
+        <w:t>8. Acceptance Endorsement &amp; Sign-Off Instructions</w:t>
+      </w:r>
+    </w:p>
+    <w:p>
+      <w:r>
+        <w:t>Upon completing the technical test scenarios and rating the ISO 25010 questionnaire:</w:t>
+        <w:br/>
+        <w:t>1. Mark your overall system acceptance decision in Part 3 of the form (Accepted, Accepted with Minor Revisions, or For Revision).</w:t>
+        <w:br/>
+        <w:t>2. Record any technical commendations, observations, or engineering recommendations.</w:t>
+        <w:br/>
+        <w:t>3. Affix your physical or digital signature, designation, and date on Page 5 of the evaluation document.</w:t>
       </w:r>
     </w:p>
     <w:sectPr>

</xml_diff>